<commit_message>
style previews: add support for character styles
- add family parameter to switch between paragraphs and characters
- cache should use it for key to avoid conflicts
- preview rendering should tak into account character style often
  doesn't set font size or other options - use default so we can
  render anything at all
- added tests, also for blank renders check

Signed-off-by: Szymon Kłos <szymon.klos@collabora.com>
Change-Id: Id555a3a69b1ede47a50b564402915f08b448769b
Reviewed-on: https://gerrit.collaboraoffice.com/c/online/+/5993
Tested-by: Jenkins CPCI <releng@collaboraoffice.com>
Reviewed-by: Michael Stahl <michael.stahl@collabora.com>
</commit_message>
<xml_diff>
--- a/engine/svx/qa/unit/data/stylePaneRecommended.docx
+++ b/engine/svx/qa/unit/data/stylePaneRecommended.docx
@@ -7,6 +7,9 @@
         <w:pStyle w:val="PlainStyle"/>
       </w:pPr>
       <w:r>
+        <w:rPr>
+          <w:rStyle w:val="PlainChar"/>
+        </w:rPr>
         <w:t>Text</w:t>
       </w:r>
     </w:p>
@@ -30,5 +33,18 @@
     <w:name w:val="Plain Style"/>
     <w:basedOn w:val="Normal"/>
   </w:style>
+  <w:style w:type="character" w:customStyle="1" w:styleId="RecoChar">
+    <w:name w:val="Reco Char"/>
+    <w:qFormat/>
+    <w:rPr>
+      <w:b/>
+    </w:rPr>
+  </w:style>
+  <w:style w:type="character" w:customStyle="1" w:styleId="PlainChar">
+    <w:name w:val="Plain Char"/>
+    <w:rPr>
+      <w:i/>
+    </w:rPr>
+  </w:style>
 </w:styles>
 </file>
</xml_diff>